<commit_message>
Updated MeshPass.docx with section about Syncing
Added sections on UserIDs and Syncing.
The Syncing section describes general procedures for syncing
between devices belong to the same user, and between devices
belonging to different users.
Also, procedures are described for syncing over a LAN, or
over the Internet.
</commit_message>
<xml_diff>
--- a/MeshPass.docx
+++ b/MeshPass.docx
@@ -129,6 +129,9 @@
       <w:r>
         <w:t>Timestamp every field, not just the record.  Then you can tell which record has newer data on a per-field basis</w:t>
       </w:r>
+      <w:r>
+        <w:t>—useful for resolving conflicts when two devices have different updates for the same record.</w:t>
+      </w:r>
     </w:p>
     <w:p>
       <w:pPr>
@@ -170,6 +173,7 @@
     </w:p>
     <w:p>
       <w:r>
+        <w:lastRenderedPageBreak/>
         <w:t xml:space="preserve">Messages should be sent with a MAC that </w:t>
       </w:r>
       <w:r>
@@ -181,7 +185,6 @@
     </w:p>
     <w:p>
       <w:r>
-        <w:lastRenderedPageBreak/>
         <w:t>For each account, keep time of last successful sync, time of last sync attempt, # of sync attempts since last successful sync.</w:t>
       </w:r>
     </w:p>
@@ -333,13 +336,7 @@
     </w:p>
     <w:p>
       <w:r>
-        <w:t xml:space="preserve">Password generator – create </w:t>
-      </w:r>
-      <w:r>
-        <w:t xml:space="preserve">named </w:t>
-      </w:r>
-      <w:r>
-        <w:t>sets of permissible special characters</w:t>
+        <w:t>Password generator – create named sets of permissible special characters</w:t>
       </w:r>
     </w:p>
     <w:p>
@@ -354,6 +351,7 @@
     </w:p>
     <w:p>
       <w:r>
+        <w:lastRenderedPageBreak/>
         <w:t>Password generator – show generated passwords with letters, numerals, and special characters in different colors (lowercase black, uppercase gray, numerals blue, specials red)</w:t>
       </w:r>
     </w:p>
@@ -515,6 +513,241 @@
       </w:pPr>
       <w:r>
         <w:t>Replace key pairs, when old key pair isn’t available/acceptable to authenticate new key pair. Similar to creating original key pair for a user or device</w:t>
+      </w:r>
+    </w:p>
+    <w:p>
+      <w:pPr>
+        <w:pStyle w:val="Heading2"/>
+      </w:pPr>
+      <w:r>
+        <w:t>User IDs</w:t>
+      </w:r>
+    </w:p>
+    <w:p>
+      <w:r>
+        <w:t>In addition to a user-specified UserName, each user also will have a numeric UserID that is used internally by MeshPass and not visible to users.  This is done to allow multiple users to have the same UserName, but not be confused for each other, thus maintaining security of their records.  The UserID will be a 64-bit integer chosen at random.  With such a large domain of UserID values, it should be nearly impossible for two users to have the same UserID number.</w:t>
+      </w:r>
+    </w:p>
+    <w:p>
+      <w:r>
+        <w:t>It is necessary to allow multiple users to have the same UserName in case two users who don’t know that they are both MeshPass users later decide to share some records.  When they connect to each other, it is necessary to ensure that MeshPass doesn’t think that they are the same user.</w:t>
+      </w:r>
+    </w:p>
+    <w:p>
+      <w:r>
+        <w:t>When MeshPass displays a list of Users and Devices that a user can sync with</w:t>
+      </w:r>
+      <w:r>
+        <w:t xml:space="preserve"> (whether during LAN sync or sync </w:t>
+      </w:r>
+      <w:r>
+        <w:t>through</w:t>
+      </w:r>
+      <w:r>
+        <w:t xml:space="preserve"> a Rendezvous Point—see the section on Syncing)</w:t>
+      </w:r>
+      <w:r>
+        <w:t xml:space="preserve">, it will be necessary to distinguish between the two users with the same UserName.  This might be done with an indication such as </w:t>
+      </w:r>
+      <w:r>
+        <w:rPr>
+          <w:i/>
+          <w:iCs/>
+        </w:rPr>
+        <w:t>username(1)</w:t>
+      </w:r>
+      <w:r>
+        <w:t xml:space="preserve"> and </w:t>
+      </w:r>
+      <w:r>
+        <w:rPr>
+          <w:i/>
+          <w:iCs/>
+        </w:rPr>
+        <w:t>username(2)</w:t>
+      </w:r>
+      <w:r>
+        <w:t>.  In this case it would be necessary to prohibit using parentheses as part of a username.</w:t>
+      </w:r>
+    </w:p>
+    <w:p>
+      <w:pPr>
+        <w:pStyle w:val="Heading2"/>
+      </w:pPr>
+      <w:r>
+        <w:t>Syncing</w:t>
+      </w:r>
+    </w:p>
+    <w:p>
+      <w:pPr>
+        <w:pStyle w:val="Heading3"/>
+      </w:pPr>
+      <w:r>
+        <w:t>Syncing with Another Device belonging to the Same User</w:t>
+      </w:r>
+    </w:p>
+    <w:p>
+      <w:r>
+        <w:t>Syncing between two devices belonging to the same user will sync all records that either device possesses.</w:t>
+      </w:r>
+    </w:p>
+    <w:p>
+      <w:pPr>
+        <w:pStyle w:val="Heading3"/>
+      </w:pPr>
+      <w:r>
+        <w:t>Syncing with a Device that Belongs to Another User</w:t>
+      </w:r>
+    </w:p>
+    <w:p>
+      <w:r>
+        <w:t>There are two stages to syncing between devices that belong to different users:</w:t>
+      </w:r>
+    </w:p>
+    <w:p>
+      <w:pPr>
+        <w:pStyle w:val="ListParagraph"/>
+        <w:numPr>
+          <w:ilvl w:val="0"/>
+          <w:numId w:val="4"/>
+        </w:numPr>
+      </w:pPr>
+      <w:r>
+        <w:lastRenderedPageBreak/>
+        <w:t>Give the requesting user the opportunity to share selected records with the other user</w:t>
+      </w:r>
+      <w:r>
+        <w:t>. Keep persistent information about which records are shared with whom.</w:t>
+      </w:r>
+    </w:p>
+    <w:p>
+      <w:pPr>
+        <w:pStyle w:val="ListParagraph"/>
+        <w:numPr>
+          <w:ilvl w:val="0"/>
+          <w:numId w:val="4"/>
+        </w:numPr>
+      </w:pPr>
+      <w:r>
+        <w:t>Sync records that belong to one user and previously have been shared with the other user.</w:t>
+      </w:r>
+    </w:p>
+    <w:p>
+      <w:r>
+        <w:t>Only one user can be the owner of a record.</w:t>
+      </w:r>
+    </w:p>
+    <w:p>
+      <w:r>
+        <w:t>The owner of a record that has been shared with other users can revoke sharing of a record</w:t>
+      </w:r>
+      <w:r>
+        <w:t xml:space="preserve"> on a per-user basis.</w:t>
+      </w:r>
+    </w:p>
+    <w:p>
+      <w:pPr>
+        <w:pStyle w:val="Heading3"/>
+      </w:pPr>
+      <w:r>
+        <w:t>Syncing over LAN</w:t>
+      </w:r>
+    </w:p>
+    <w:p>
+      <w:r>
+        <w:t>Upon startup, all instances of MeshPass will listen on a multicast address in case other instances on the same LAN want to find other instances for the purpose of syncing records.</w:t>
+      </w:r>
+    </w:p>
+    <w:p>
+      <w:r>
+        <w:t>When a user running an instance of MeshPass wants to sync with another instance on the LAN, s/he will start the LAN sync process, which begins by transmitting a multicast message throughout the LAN to find other instances.  MeshPass will display all the other instances that it finds, along with their userName and deviceID.  The user then selects which device s/he wants to sync with.</w:t>
+      </w:r>
+    </w:p>
+    <w:p>
+      <w:pPr>
+        <w:pStyle w:val="Heading3"/>
+      </w:pPr>
+      <w:r>
+        <w:t>Syncing over WAN</w:t>
+      </w:r>
+    </w:p>
+    <w:p>
+      <w:pPr>
+        <w:pStyle w:val="Heading4"/>
+      </w:pPr>
+      <w:r>
+        <w:t>Syncing over WAN with Direct Addressing</w:t>
+      </w:r>
+    </w:p>
+    <w:p>
+      <w:r>
+        <w:t xml:space="preserve">It is not intended for mobile devices to the object (target) of a Direct Addressing call.  This might be most useful for </w:t>
+      </w:r>
+      <w:r>
+        <w:t>users</w:t>
+      </w:r>
+      <w:r>
+        <w:t xml:space="preserve"> with a MeshPass “server” (really just another instance of MeshPass</w:t>
+      </w:r>
+      <w:r>
+        <w:t>)</w:t>
+      </w:r>
+      <w:r>
+        <w:t>.  A server can be addressed within an organization with a fixed IP address; outside the organization, the server can be referenced by a fixed domain name; the server can have its own port mapping in the Network Address Translation (NAT) on its network (usually runs in the gateway router or firewall)</w:t>
+      </w:r>
+      <w:r>
+        <w:t xml:space="preserve"> to allow TCP calls coming in from the Internet</w:t>
+      </w:r>
+      <w:r>
+        <w:t>.  Users with more than two MeshPass devices might like a server, and then each of the user’s devices only needs to sync with the server.</w:t>
+      </w:r>
+    </w:p>
+    <w:p>
+      <w:r>
+        <w:t>Note that each user in a family or business that wants this hub-and-spoke syncing methodology must run his/her own server (a process, not necessarily a separate physical device, although a separate MeshPass deviceID would need to be assigned.)  For larger groups of users, it probably makes sense to write an actual MeshPass server program that can serve multiple users and keep their login credentials in a secure store.</w:t>
+      </w:r>
+    </w:p>
+    <w:p>
+      <w:pPr>
+        <w:pStyle w:val="Heading4"/>
+      </w:pPr>
+      <w:r>
+        <w:t>Syncing over WAN with Rendezvous Point</w:t>
+      </w:r>
+    </w:p>
+    <w:p>
+      <w:r>
+        <w:t>Upon startup, instances of MeshPass that have been configured with a rendezvous point (RP), will establish a TCP connection with the RP and maintain that connection for as long as the instance is running.  The instance will send keepalive messages</w:t>
+      </w:r>
+      <w:r>
+        <w:t xml:space="preserve"> at the Application layer (TCP KeepAlives are an optional feature, and can’t be depended on</w:t>
+      </w:r>
+      <w:r>
+        <w:t>; also, the parameters for TCP KeepAlives seem to be of system scope, not per process or connection</w:t>
+      </w:r>
+      <w:r>
+        <w:t>).</w:t>
+      </w:r>
+      <w:r>
+        <w:t xml:space="preserve">  By maintaining the connection, the RP will know when the instance has terminated, because the</w:t>
+      </w:r>
+      <w:r>
+        <w:t xml:space="preserve"> KeepAlives will have stopped.  </w:t>
+      </w:r>
+      <w:r>
+        <w:t>Upon losing the connection to the MeshPass instance, the RP will remove the instance from its list of active instances.</w:t>
+      </w:r>
+      <w:r>
+        <w:t xml:space="preserve">  An entry in the list of active instances consists of a userName, a deviceID, an IPv4 address, and a TCP port number.</w:t>
+      </w:r>
+    </w:p>
+    <w:p>
+      <w:r>
+        <w:t xml:space="preserve">Will synced records pass through the RP, or will the RP just assist the two MeshPass devices to connect directly with each other?  For security, it would be preferable for the RP to only assist in a direct </w:t>
+      </w:r>
+      <w:r>
+        <w:lastRenderedPageBreak/>
+        <w:t>connection.  But the RP can also help when both MeshPass devices are behind NATs, and neither can be addressed directly.</w:t>
       </w:r>
     </w:p>
     <w:sectPr>
@@ -756,6 +989,119 @@
     </w:lvl>
   </w:abstractNum>
   <w:abstractNum w:abstractNumId="2" w15:restartNumberingAfterBreak="0">
+    <w:nsid w:val="3EB02086"/>
+    <w:multiLevelType w:val="hybridMultilevel"/>
+    <w:tmpl w:val="F3B623AE"/>
+    <w:lvl w:ilvl="0" w:tplc="04090001">
+      <w:start w:val="1"/>
+      <w:numFmt w:val="bullet"/>
+      <w:lvlText w:val=""/>
+      <w:lvlJc w:val="left"/>
+      <w:pPr>
+        <w:ind w:left="720" w:hanging="360"/>
+      </w:pPr>
+      <w:rPr>
+        <w:rFonts w:ascii="Symbol" w:hAnsi="Symbol" w:hint="default"/>
+      </w:rPr>
+    </w:lvl>
+    <w:lvl w:ilvl="1" w:tplc="04090003" w:tentative="1">
+      <w:start w:val="1"/>
+      <w:numFmt w:val="bullet"/>
+      <w:lvlText w:val="o"/>
+      <w:lvlJc w:val="left"/>
+      <w:pPr>
+        <w:ind w:left="1440" w:hanging="360"/>
+      </w:pPr>
+      <w:rPr>
+        <w:rFonts w:ascii="Courier New" w:hAnsi="Courier New" w:cs="Courier New" w:hint="default"/>
+      </w:rPr>
+    </w:lvl>
+    <w:lvl w:ilvl="2" w:tplc="04090005" w:tentative="1">
+      <w:start w:val="1"/>
+      <w:numFmt w:val="bullet"/>
+      <w:lvlText w:val=""/>
+      <w:lvlJc w:val="left"/>
+      <w:pPr>
+        <w:ind w:left="2160" w:hanging="360"/>
+      </w:pPr>
+      <w:rPr>
+        <w:rFonts w:ascii="Wingdings" w:hAnsi="Wingdings" w:hint="default"/>
+      </w:rPr>
+    </w:lvl>
+    <w:lvl w:ilvl="3" w:tplc="04090001" w:tentative="1">
+      <w:start w:val="1"/>
+      <w:numFmt w:val="bullet"/>
+      <w:lvlText w:val=""/>
+      <w:lvlJc w:val="left"/>
+      <w:pPr>
+        <w:ind w:left="2880" w:hanging="360"/>
+      </w:pPr>
+      <w:rPr>
+        <w:rFonts w:ascii="Symbol" w:hAnsi="Symbol" w:hint="default"/>
+      </w:rPr>
+    </w:lvl>
+    <w:lvl w:ilvl="4" w:tplc="04090003" w:tentative="1">
+      <w:start w:val="1"/>
+      <w:numFmt w:val="bullet"/>
+      <w:lvlText w:val="o"/>
+      <w:lvlJc w:val="left"/>
+      <w:pPr>
+        <w:ind w:left="3600" w:hanging="360"/>
+      </w:pPr>
+      <w:rPr>
+        <w:rFonts w:ascii="Courier New" w:hAnsi="Courier New" w:cs="Courier New" w:hint="default"/>
+      </w:rPr>
+    </w:lvl>
+    <w:lvl w:ilvl="5" w:tplc="04090005" w:tentative="1">
+      <w:start w:val="1"/>
+      <w:numFmt w:val="bullet"/>
+      <w:lvlText w:val=""/>
+      <w:lvlJc w:val="left"/>
+      <w:pPr>
+        <w:ind w:left="4320" w:hanging="360"/>
+      </w:pPr>
+      <w:rPr>
+        <w:rFonts w:ascii="Wingdings" w:hAnsi="Wingdings" w:hint="default"/>
+      </w:rPr>
+    </w:lvl>
+    <w:lvl w:ilvl="6" w:tplc="04090001" w:tentative="1">
+      <w:start w:val="1"/>
+      <w:numFmt w:val="bullet"/>
+      <w:lvlText w:val=""/>
+      <w:lvlJc w:val="left"/>
+      <w:pPr>
+        <w:ind w:left="5040" w:hanging="360"/>
+      </w:pPr>
+      <w:rPr>
+        <w:rFonts w:ascii="Symbol" w:hAnsi="Symbol" w:hint="default"/>
+      </w:rPr>
+    </w:lvl>
+    <w:lvl w:ilvl="7" w:tplc="04090003" w:tentative="1">
+      <w:start w:val="1"/>
+      <w:numFmt w:val="bullet"/>
+      <w:lvlText w:val="o"/>
+      <w:lvlJc w:val="left"/>
+      <w:pPr>
+        <w:ind w:left="5760" w:hanging="360"/>
+      </w:pPr>
+      <w:rPr>
+        <w:rFonts w:ascii="Courier New" w:hAnsi="Courier New" w:cs="Courier New" w:hint="default"/>
+      </w:rPr>
+    </w:lvl>
+    <w:lvl w:ilvl="8" w:tplc="04090005" w:tentative="1">
+      <w:start w:val="1"/>
+      <w:numFmt w:val="bullet"/>
+      <w:lvlText w:val=""/>
+      <w:lvlJc w:val="left"/>
+      <w:pPr>
+        <w:ind w:left="6480" w:hanging="360"/>
+      </w:pPr>
+      <w:rPr>
+        <w:rFonts w:ascii="Wingdings" w:hAnsi="Wingdings" w:hint="default"/>
+      </w:rPr>
+    </w:lvl>
+  </w:abstractNum>
+  <w:abstractNum w:abstractNumId="3" w15:restartNumberingAfterBreak="0">
     <w:nsid w:val="5A8724BB"/>
     <w:multiLevelType w:val="hybridMultilevel"/>
     <w:tmpl w:val="8DCA1716"/>
@@ -875,6 +1221,9 @@
     <w:abstractNumId w:val="1"/>
   </w:num>
   <w:num w:numId="3" w16cid:durableId="1236622007">
+    <w:abstractNumId w:val="3"/>
+  </w:num>
+  <w:num w:numId="4" w16cid:durableId="491868456">
     <w:abstractNumId w:val="2"/>
   </w:num>
 </w:numbering>
@@ -1325,6 +1674,50 @@
       <w:szCs w:val="26"/>
     </w:rPr>
   </w:style>
+  <w:style w:type="paragraph" w:styleId="Heading3">
+    <w:name w:val="heading 3"/>
+    <w:basedOn w:val="Normal"/>
+    <w:next w:val="Normal"/>
+    <w:link w:val="Heading3Char"/>
+    <w:uiPriority w:val="9"/>
+    <w:unhideWhenUsed/>
+    <w:qFormat/>
+    <w:rsid w:val="00896D9A"/>
+    <w:pPr>
+      <w:keepNext/>
+      <w:keepLines/>
+      <w:spacing w:before="40" w:after="0"/>
+      <w:outlineLvl w:val="2"/>
+    </w:pPr>
+    <w:rPr>
+      <w:rFonts w:asciiTheme="majorHAnsi" w:eastAsiaTheme="majorEastAsia" w:hAnsiTheme="majorHAnsi" w:cstheme="majorBidi"/>
+      <w:color w:val="1F3763" w:themeColor="accent1" w:themeShade="7F"/>
+      <w:sz w:val="24"/>
+      <w:szCs w:val="24"/>
+    </w:rPr>
+  </w:style>
+  <w:style w:type="paragraph" w:styleId="Heading4">
+    <w:name w:val="heading 4"/>
+    <w:basedOn w:val="Normal"/>
+    <w:next w:val="Normal"/>
+    <w:link w:val="Heading4Char"/>
+    <w:uiPriority w:val="9"/>
+    <w:unhideWhenUsed/>
+    <w:qFormat/>
+    <w:rsid w:val="00896D9A"/>
+    <w:pPr>
+      <w:keepNext/>
+      <w:keepLines/>
+      <w:spacing w:before="40" w:after="0"/>
+      <w:outlineLvl w:val="3"/>
+    </w:pPr>
+    <w:rPr>
+      <w:rFonts w:asciiTheme="majorHAnsi" w:eastAsiaTheme="majorEastAsia" w:hAnsiTheme="majorHAnsi" w:cstheme="majorBidi"/>
+      <w:i/>
+      <w:iCs/>
+      <w:color w:val="2F5496" w:themeColor="accent1" w:themeShade="BF"/>
+    </w:rPr>
+  </w:style>
   <w:style w:type="character" w:default="1" w:styleId="DefaultParagraphFont">
     <w:name w:val="Default Paragraph Font"/>
     <w:uiPriority w:val="1"/>
@@ -1475,6 +1868,32 @@
       <w:color w:val="2F5496" w:themeColor="accent1" w:themeShade="BF"/>
       <w:sz w:val="26"/>
       <w:szCs w:val="26"/>
+    </w:rPr>
+  </w:style>
+  <w:style w:type="character" w:customStyle="1" w:styleId="Heading3Char">
+    <w:name w:val="Heading 3 Char"/>
+    <w:basedOn w:val="DefaultParagraphFont"/>
+    <w:link w:val="Heading3"/>
+    <w:uiPriority w:val="9"/>
+    <w:rsid w:val="00896D9A"/>
+    <w:rPr>
+      <w:rFonts w:asciiTheme="majorHAnsi" w:eastAsiaTheme="majorEastAsia" w:hAnsiTheme="majorHAnsi" w:cstheme="majorBidi"/>
+      <w:color w:val="1F3763" w:themeColor="accent1" w:themeShade="7F"/>
+      <w:sz w:val="24"/>
+      <w:szCs w:val="24"/>
+    </w:rPr>
+  </w:style>
+  <w:style w:type="character" w:customStyle="1" w:styleId="Heading4Char">
+    <w:name w:val="Heading 4 Char"/>
+    <w:basedOn w:val="DefaultParagraphFont"/>
+    <w:link w:val="Heading4"/>
+    <w:uiPriority w:val="9"/>
+    <w:rsid w:val="00896D9A"/>
+    <w:rPr>
+      <w:rFonts w:asciiTheme="majorHAnsi" w:eastAsiaTheme="majorEastAsia" w:hAnsiTheme="majorHAnsi" w:cstheme="majorBidi"/>
+      <w:i/>
+      <w:iCs/>
+      <w:color w:val="2F5496" w:themeColor="accent1" w:themeShade="BF"/>
     </w:rPr>
   </w:style>
 </w:styles>

</xml_diff>